<commit_message>
Fix zip entry slashes and properly format docx template tags
</commit_message>
<xml_diff>
--- a/public/templates/absences_template.docx
+++ b/public/templates/absences_template.docx
@@ -1,40 +1,5 @@
 
-<file path=docProps\app.xml><?xml version="1.0" encoding="utf-8"?>
-<Properties xmlns="http://schemas.openxmlformats.org/officeDocument/2006/extended-properties" xmlns:vt="http://schemas.openxmlformats.org/officeDocument/2006/docPropsVTypes">
-  <Template>Normal.dotm</Template>
-  <TotalTime>6</TotalTime>
-  <Pages>1</Pages>
-  <Words>102</Words>
-  <Characters>583</Characters>
-  <Application>Microsoft Office Word</Application>
-  <DocSecurity>0</DocSecurity>
-  <Lines>4</Lines>
-  <Paragraphs>1</Paragraphs>
-  <ScaleCrop>false</ScaleCrop>
-  <Company/>
-  <LinksUpToDate>false</LinksUpToDate>
-  <CharactersWithSpaces>684</CharactersWithSpaces>
-  <SharedDoc>false</SharedDoc>
-  <HyperlinksChanged>false</HyperlinksChanged>
-  <AppVersion>16.0000</AppVersion>
-</Properties>
-</file>
-
-<file path=docProps\core.xml><?xml version="1.0" encoding="utf-8"?>
-<cp:coreProperties xmlns:cp="http://schemas.openxmlformats.org/package/2006/metadata/core-properties" xmlns:dc="http://purl.org/dc/elements/1.1/" xmlns:dcterms="http://purl.org/dc/terms/" xmlns:dcmitype="http://purl.org/dc/dcmitype/" xmlns:xsi="http://www.w3.org/2001/XMLSchema-instance">
-  <dc:title/>
-  <dc:subject/>
-  <dc:creator>Евгений Железняк</dc:creator>
-  <cp:keywords/>
-  <dc:description/>
-  <cp:lastModifiedBy>Евгений Железняк</cp:lastModifiedBy>
-  <cp:revision>2</cp:revision>
-  <dcterms:created xsi:type="dcterms:W3CDTF">2026-06-15T21:02:00Z</dcterms:created>
-  <dcterms:modified xsi:type="dcterms:W3CDTF">2026-06-15T21:10:00Z</dcterms:modified>
-</cp:coreProperties>
-</file>
-
-<file path=word\document.xml><?xml version="1.0" encoding="utf-8"?>
+<file path=word/document.xml><?xml version="1.0" encoding="utf-8"?>
 <w:document xmlns:wpc="http://schemas.microsoft.com/office/word/2010/wordprocessingCanvas" xmlns:cx="http://schemas.microsoft.com/office/drawing/2014/chartex" xmlns:cx1="http://schemas.microsoft.com/office/drawing/2015/9/8/chartex" xmlns:cx2="http://schemas.microsoft.com/office/drawing/2015/10/21/chartex" xmlns:cx3="http://schemas.microsoft.com/office/drawing/2016/5/9/chartex" xmlns:cx4="http://schemas.microsoft.com/office/drawing/2016/5/10/chartex" xmlns:cx5="http://schemas.microsoft.com/office/drawing/2016/5/11/chartex" xmlns:cx6="http://schemas.microsoft.com/office/drawing/2016/5/12/chartex" xmlns:cx7="http://schemas.microsoft.com/office/drawing/2016/5/13/chartex" xmlns:cx8="http://schemas.microsoft.com/office/drawing/2016/5/14/chartex" xmlns:mc="http://schemas.openxmlformats.org/markup-compatibility/2006" xmlns:aink="http://schemas.microsoft.com/office/drawing/2016/ink" xmlns:am3d="http://schemas.microsoft.com/office/drawing/2017/model3d" xmlns:o="urn:schemas-microsoft-com:office:office" xmlns:r="http://schemas.openxmlformats.org/officeDocument/2006/relationships" xmlns:m="http://schemas.openxmlformats.org/officeDocument/2006/math" xmlns:v="urn:schemas-microsoft-com:vml" xmlns:wp14="http://schemas.microsoft.com/office/word/2010/wordprocessingDrawing" xmlns:wp="http://schemas.openxmlformats.org/drawingml/2006/wordprocessingDrawing" xmlns:w10="urn:schemas-microsoft-com:office:word" xmlns:w="http://schemas.openxmlformats.org/wordprocessingml/2006/main" xmlns:w14="http://schemas.microsoft.com/office/word/2010/wordml" xmlns:w15="http://schemas.microsoft.com/office/word/2012/wordml" xmlns:w16cex="http://schemas.microsoft.com/office/word/2018/wordml/cex" xmlns:w16cid="http://schemas.microsoft.com/office/word/2016/wordml/cid" xmlns:w16="http://schemas.microsoft.com/office/word/2018/wordml" xmlns:w16se="http://schemas.microsoft.com/office/word/2015/wordml/symex" xmlns:wpg="http://schemas.microsoft.com/office/word/2010/wordprocessingGroup" xmlns:wpi="http://schemas.microsoft.com/office/word/2010/wordprocessingInk" xmlns:wne="http://schemas.microsoft.com/office/word/2006/wordml" xmlns:wps="http://schemas.microsoft.com/office/word/2010/wordprocessingShape" mc:Ignorable="w14 w15 w16se w16cid w16 w16cex wp14">
   <w:body>
     <w:tbl>
@@ -606,23 +571,9 @@
           </w:tcPr>
           <w:p>
             <w:pPr>
-              <w:widowControl/>
               <w:jc w:val="center"/>
-              <w:textAlignment w:val="center"/>
-              <w:rPr>
-                <w:rFonts w:cs="Calibri"/>
-                <w:sz w:val="28"/>
-                <w:szCs w:val="28"/>
-              </w:rPr>
-            </w:pPr>
-            <w:r>
-              <w:rPr>
-                <w:rFonts w:ascii="Calibri" w:eastAsia="SimSun" w:hAnsi="Calibri" w:cs="Calibri"/>
-                <w:color w:val="000000"/>
-                <w:sz w:val="24"/>
-                <w:szCs w:val="24"/>
-                <w:lang w:val="en-US" w:eastAsia="zh-CN" w:bidi="ar"/>
-              </w:rPr>
+            </w:pPr>
+            <w:r>
               <w:t>{#fighters}{index}</w:t>
             </w:r>
           </w:p>
@@ -634,71 +585,11 @@
           </w:tcPr>
           <w:p>
             <w:pPr>
-              <w:widowControl/>
               <w:jc w:val="center"/>
-              <w:textAlignment w:val="center"/>
-              <w:rPr>
-                <w:rFonts w:cs="Calibri"/>
-                <w:sz w:val="28"/>
-                <w:szCs w:val="28"/>
-              </w:rPr>
-            </w:pPr>
-            <w:proofErr w:type="spellStart"/>
-            <w:r>
-              <w:rPr>
-                <w:rFonts w:ascii="Calibri" w:eastAsia="SimSun" w:hAnsi="Calibri" w:cs="Calibri"/>
-                <w:color w:val="000000"/>
-                <w:sz w:val="24"/>
-                <w:szCs w:val="24"/>
-                <w:lang w:val="en-US" w:eastAsia="zh-CN" w:bidi="ar"/>
-              </w:rPr>
-              <w:t>Бажанов</w:t>
-            </w:r>
-            <w:proofErr w:type="spellEnd"/>
-            <w:r>
-              <w:rPr>
-                <w:rFonts w:ascii="Calibri" w:eastAsia="SimSun" w:hAnsi="Calibri" w:cs="Calibri"/>
-                <w:color w:val="000000"/>
-                <w:sz w:val="24"/>
-                <w:szCs w:val="24"/>
-                <w:lang w:val="en-US" w:eastAsia="zh-CN" w:bidi="ar"/>
-              </w:rPr>
-              <w:t xml:space="preserve"> </w:t>
-            </w:r>
-            <w:proofErr w:type="spellStart"/>
-            <w:r>
-              <w:rPr>
-                <w:rFonts w:ascii="Calibri" w:eastAsia="SimSun" w:hAnsi="Calibri" w:cs="Calibri"/>
-                <w:color w:val="000000"/>
-                <w:sz w:val="24"/>
-                <w:szCs w:val="24"/>
-                <w:lang w:val="en-US" w:eastAsia="zh-CN" w:bidi="ar"/>
-              </w:rPr>
-              <w:t>Иван</w:t>
-            </w:r>
-            <w:proofErr w:type="spellEnd"/>
-            <w:r>
-              <w:rPr>
-                <w:rFonts w:ascii="Calibri" w:eastAsia="SimSun" w:hAnsi="Calibri" w:cs="Calibri"/>
-                <w:color w:val="000000"/>
-                <w:sz w:val="24"/>
-                <w:szCs w:val="24"/>
-                <w:lang w:val="en-US" w:eastAsia="zh-CN" w:bidi="ar"/>
-              </w:rPr>
-              <w:t xml:space="preserve"> </w:t>
-            </w:r>
-            <w:proofErr w:type="spellStart"/>
-            <w:r>
-              <w:rPr>
-                <w:rFonts w:ascii="Calibri" w:eastAsia="SimSun" w:hAnsi="Calibri" w:cs="Calibri"/>
-                <w:color w:val="000000"/>
-                <w:sz w:val="24"/>
-                <w:szCs w:val="24"/>
-                <w:lang w:val="en-US" w:eastAsia="zh-CN" w:bidi="ar"/>
-              </w:rPr>
-              <w:t>Александрович</w:t>
-            </w:r>
-            <w:proofErr w:type="spellEnd"/>
+            </w:pPr>
+            <w:r>
+              <w:t>{fullName}</w:t>
+            </w:r>
           </w:p>
         </w:tc>
         <w:tc>
@@ -708,23 +599,9 @@
           </w:tcPr>
           <w:p>
             <w:pPr>
-              <w:widowControl/>
               <w:jc w:val="center"/>
-              <w:textAlignment w:val="center"/>
-              <w:rPr>
-                <w:rFonts w:cs="Calibri"/>
-                <w:sz w:val="28"/>
-                <w:szCs w:val="28"/>
-              </w:rPr>
-            </w:pPr>
-            <w:r>
-              <w:rPr>
-                <w:rFonts w:ascii="Calibri" w:eastAsia="SimSun" w:hAnsi="Calibri" w:cs="Calibri"/>
-                <w:color w:val="000000"/>
-                <w:sz w:val="24"/>
-                <w:szCs w:val="24"/>
-                <w:lang w:val="en-US" w:eastAsia="zh-CN" w:bidi="ar"/>
-              </w:rPr>
+            </w:pPr>
+            <w:r>
               <w:t>{studyGroup}</w:t>
             </w:r>
           </w:p>
@@ -820,90 +697,7 @@
 </w:document>
 </file>
 
-<file path=word\fontTable.xml><?xml version="1.0" encoding="utf-8"?>
-<w:fonts xmlns:mc="http://schemas.openxmlformats.org/markup-compatibility/2006" xmlns:r="http://schemas.openxmlformats.org/officeDocument/2006/relationships" xmlns:w="http://schemas.openxmlformats.org/wordprocessingml/2006/main" xmlns:w14="http://schemas.microsoft.com/office/word/2010/wordml" xmlns:w15="http://schemas.microsoft.com/office/word/2012/wordml" xmlns:w16cex="http://schemas.microsoft.com/office/word/2018/wordml/cex" xmlns:w16cid="http://schemas.microsoft.com/office/word/2016/wordml/cid" xmlns:w16="http://schemas.microsoft.com/office/word/2018/wordml" xmlns:w16se="http://schemas.microsoft.com/office/word/2015/wordml/symex" mc:Ignorable="w14 w15 w16se w16cid w16 w16cex">
-  <w:font w:name="Calibri">
-    <w:panose1 w:val="020F0502020204030204"/>
-    <w:charset w:val="CC"/>
-    <w:family w:val="swiss"/>
-    <w:pitch w:val="variable"/>
-    <w:sig w:usb0="E4002EFF" w:usb1="C000247B" w:usb2="00000009" w:usb3="00000000" w:csb0="000001FF" w:csb1="00000000"/>
-  </w:font>
-  <w:font w:name="Times New Roman">
-    <w:panose1 w:val="02020603050405020304"/>
-    <w:charset w:val="CC"/>
-    <w:family w:val="roman"/>
-    <w:pitch w:val="variable"/>
-    <w:sig w:usb0="E0002EFF" w:usb1="C000785B" w:usb2="00000009" w:usb3="00000000" w:csb0="000001FF" w:csb1="00000000"/>
-  </w:font>
-  <w:font w:name="SimSun">
-    <w:altName w:val="宋体"/>
-    <w:panose1 w:val="02010600030101010101"/>
-    <w:charset w:val="86"/>
-    <w:family w:val="auto"/>
-    <w:pitch w:val="variable"/>
-    <w:sig w:usb0="00000203" w:usb1="288F0000" w:usb2="00000016" w:usb3="00000000" w:csb0="00040001" w:csb1="00000000"/>
-  </w:font>
-  <w:font w:name="Calibri Light">
-    <w:panose1 w:val="020F0302020204030204"/>
-    <w:charset w:val="CC"/>
-    <w:family w:val="swiss"/>
-    <w:pitch w:val="variable"/>
-    <w:sig w:usb0="E4002EFF" w:usb1="C000247B" w:usb2="00000009" w:usb3="00000000" w:csb0="000001FF" w:csb1="00000000"/>
-  </w:font>
-</w:fonts>
-</file>
-
-<file path=word\settings.xml><?xml version="1.0" encoding="utf-8"?>
-<w:settings xmlns:mc="http://schemas.openxmlformats.org/markup-compatibility/2006" xmlns:o="urn:schemas-microsoft-com:office:office" xmlns:r="http://schemas.openxmlformats.org/officeDocument/2006/relationships" xmlns:m="http://schemas.openxmlformats.org/officeDocument/2006/math" xmlns:v="urn:schemas-microsoft-com:vml" xmlns:w10="urn:schemas-microsoft-com:office:word" xmlns:w="http://schemas.openxmlformats.org/wordprocessingml/2006/main" xmlns:w14="http://schemas.microsoft.com/office/word/2010/wordml" xmlns:w15="http://schemas.microsoft.com/office/word/2012/wordml" xmlns:w16cex="http://schemas.microsoft.com/office/word/2018/wordml/cex" xmlns:w16cid="http://schemas.microsoft.com/office/word/2016/wordml/cid" xmlns:w16="http://schemas.microsoft.com/office/word/2018/wordml" xmlns:w16se="http://schemas.microsoft.com/office/word/2015/wordml/symex" xmlns:sl="http://schemas.openxmlformats.org/schemaLibrary/2006/main" mc:Ignorable="w14 w15 w16se w16cid w16 w16cex">
-  <w:zoom w:percent="105"/>
-  <w:proofState w:spelling="clean" w:grammar="clean"/>
-  <w:defaultTabStop w:val="708"/>
-  <w:characterSpacingControl w:val="doNotCompress"/>
-  <w:compat>
-    <w:compatSetting w:name="compatibilityMode" w:uri="http://schemas.microsoft.com/office/word" w:val="15"/>
-    <w:compatSetting w:name="overrideTableStyleFontSizeAndJustification" w:uri="http://schemas.microsoft.com/office/word" w:val="1"/>
-    <w:compatSetting w:name="enableOpenTypeFeatures" w:uri="http://schemas.microsoft.com/office/word" w:val="1"/>
-    <w:compatSetting w:name="doNotFlipMirrorIndents" w:uri="http://schemas.microsoft.com/office/word" w:val="1"/>
-    <w:compatSetting w:name="differentiateMultirowTableHeaders" w:uri="http://schemas.microsoft.com/office/word" w:val="1"/>
-    <w:compatSetting w:name="useWord2013TrackBottomHyphenation" w:uri="http://schemas.microsoft.com/office/word" w:val="0"/>
-  </w:compat>
-  <w:rsids>
-    <w:rsidRoot w:val="00495910"/>
-    <w:rsid w:val="00495910"/>
-    <w:rsid w:val="008E275F"/>
-    <w:rsid w:val="00F14216"/>
-  </w:rsids>
-  <m:mathPr>
-    <m:mathFont m:val="Cambria Math"/>
-    <m:brkBin m:val="before"/>
-    <m:brkBinSub m:val="--"/>
-    <m:smallFrac m:val="0"/>
-    <m:dispDef/>
-    <m:lMargin m:val="0"/>
-    <m:rMargin m:val="0"/>
-    <m:defJc m:val="centerGroup"/>
-    <m:wrapIndent m:val="1440"/>
-    <m:intLim m:val="subSup"/>
-    <m:naryLim m:val="undOvr"/>
-  </m:mathPr>
-  <w:themeFontLang w:val="ru-RU"/>
-  <w:clrSchemeMapping w:bg1="light1" w:t1="dark1" w:bg2="light2" w:t2="dark2" w:accent1="accent1" w:accent2="accent2" w:accent3="accent3" w:accent4="accent4" w:accent5="accent5" w:accent6="accent6" w:hyperlink="hyperlink" w:followedHyperlink="followedHyperlink"/>
-  <w:shapeDefaults>
-    <o:shapedefaults v:ext="edit" spidmax="1026"/>
-    <o:shapelayout v:ext="edit">
-      <o:idmap v:ext="edit" data="1"/>
-    </o:shapelayout>
-  </w:shapeDefaults>
-  <w:decimalSymbol w:val=","/>
-  <w:listSeparator w:val=";"/>
-  <w14:docId w14:val="0AA2F4B8"/>
-  <w15:chartTrackingRefBased/>
-  <w15:docId w15:val="{507DE51C-D29F-4A73-9D94-4D03BBEB20B3}"/>
-</w:settings>
-</file>
-
-<file path=word\styles.xml><?xml version="1.0" encoding="utf-8"?>
+<file path=word/styles.xml><?xml version="1.0" encoding="utf-8"?>
 <w:styles xmlns:mc="http://schemas.openxmlformats.org/markup-compatibility/2006" xmlns:r="http://schemas.openxmlformats.org/officeDocument/2006/relationships" xmlns:w="http://schemas.openxmlformats.org/wordprocessingml/2006/main" xmlns:w14="http://schemas.microsoft.com/office/word/2010/wordml" xmlns:w15="http://schemas.microsoft.com/office/word/2012/wordml" xmlns:w16cex="http://schemas.microsoft.com/office/word/2018/wordml/cex" xmlns:w16cid="http://schemas.microsoft.com/office/word/2016/wordml/cid" xmlns:w16="http://schemas.microsoft.com/office/word/2018/wordml" xmlns:w16se="http://schemas.microsoft.com/office/word/2015/wordml/symex" mc:Ignorable="w14 w15 w16se w16cid w16 w16cex">
   <w:docDefaults>
     <w:rPrDefault>
@@ -1346,7 +1140,7 @@
 </w:styles>
 </file>
 
-<file path=word\theme\theme1.xml><?xml version="1.0" encoding="utf-8"?>
+<file path=word/theme/theme1.xml><?xml version="1.0" encoding="utf-8"?>
 <a:theme xmlns:a="http://schemas.openxmlformats.org/drawingml/2006/main" name="Тема Office">
   <a:themeElements>
     <a:clrScheme name="Стандартная">
@@ -1605,11 +1399,4 @@
     </a:ext>
   </a:extLst>
 </a:theme>
-</file>
-
-<file path=word\webSettings.xml><?xml version="1.0" encoding="utf-8"?>
-<w:webSettings xmlns:mc="http://schemas.openxmlformats.org/markup-compatibility/2006" xmlns:r="http://schemas.openxmlformats.org/officeDocument/2006/relationships" xmlns:w="http://schemas.openxmlformats.org/wordprocessingml/2006/main" xmlns:w14="http://schemas.microsoft.com/office/word/2010/wordml" xmlns:w15="http://schemas.microsoft.com/office/word/2012/wordml" xmlns:w16cex="http://schemas.microsoft.com/office/word/2018/wordml/cex" xmlns:w16cid="http://schemas.microsoft.com/office/word/2016/wordml/cid" xmlns:w16="http://schemas.microsoft.com/office/word/2018/wordml" xmlns:w16se="http://schemas.microsoft.com/office/word/2015/wordml/symex" mc:Ignorable="w14 w15 w16se w16cid w16 w16cex">
-  <w:optimizeForBrowser/>
-  <w:allowPNG/>
-</w:webSettings>
 </file>
</xml_diff>

<commit_message>
Format dates with newlines and apply Times New Roman to template cells
</commit_message>
<xml_diff>
--- a/public/templates/absences_template.docx
+++ b/public/templates/absences_template.docx
@@ -574,6 +574,11 @@
               <w:jc w:val="center"/>
             </w:pPr>
             <w:r>
+              <w:rPr>
+                <w:rFonts w:ascii="Times New Roman" w:hAnsi="Times New Roman" w:cs="Times New Roman"/>
+                <w:sz w:val="24"/>
+                <w:szCs w:val="24"/>
+              </w:rPr>
               <w:t>{#fighters}{index}</w:t>
             </w:r>
           </w:p>
@@ -588,6 +593,11 @@
               <w:jc w:val="center"/>
             </w:pPr>
             <w:r>
+              <w:rPr>
+                <w:rFonts w:ascii="Times New Roman" w:hAnsi="Times New Roman" w:cs="Times New Roman"/>
+                <w:sz w:val="24"/>
+                <w:szCs w:val="24"/>
+              </w:rPr>
               <w:t>{fullName}</w:t>
             </w:r>
           </w:p>
@@ -602,6 +612,11 @@
               <w:jc w:val="center"/>
             </w:pPr>
             <w:r>
+              <w:rPr>
+                <w:rFonts w:ascii="Times New Roman" w:hAnsi="Times New Roman" w:cs="Times New Roman"/>
+                <w:sz w:val="24"/>
+                <w:szCs w:val="24"/>
+              </w:rPr>
               <w:t>{studyGroup}</w:t>
             </w:r>
           </w:p>
@@ -616,6 +631,11 @@
               <w:jc w:val="center"/>
             </w:pPr>
             <w:r>
+              <w:rPr>
+                <w:rFonts w:ascii="Times New Roman" w:hAnsi="Times New Roman" w:cs="Times New Roman"/>
+                <w:sz w:val="24"/>
+                <w:szCs w:val="24"/>
+              </w:rPr>
               <w:t>{dates}{/fighters}</w:t>
             </w:r>
           </w:p>

</xml_diff>